<commit_message>
Penyesuaian Template Surat #2
</commit_message>
<xml_diff>
--- a/surat/Surat Undangan Seminar.docx
+++ b/surat/Surat Undangan Seminar.docx
@@ -4,1397 +4,884 @@
   <w:body>
     <w:p>
       <w:pPr>
-        <w:tabs>
-          <w:tab w:val="left" w:pos="1134"/>
-        </w:tabs>
-        <w:rPr>
-          <w:sz w:val="12"/>
-          <w:szCs w:val="12"/>
-          <w:lang w:val="sv-SE"/>
-        </w:rPr>
-      </w:pPr>
-    </w:p>
-    <w:p>
-      <w:pPr>
-        <w:tabs>
-          <w:tab w:val="left" w:pos="1985"/>
-        </w:tabs>
+        <w:sz w:val="12"/>
+        <w:szCs w:val="12"/>
+        <w:lang w:val="sv-SE"/>
+      </w:pPr>
+    </w:p>
+    <w:p>
+      <w:pPr>
         <w:ind w:left="567" w:right="617"/>
-        <w:rPr>
-          <w:lang w:val="sv-SE"/>
-        </w:rPr>
-      </w:pPr>
-      <w:r>
-        <w:rPr>
-          <w:lang w:val="sv-SE"/>
-        </w:rPr>
+        <w:lang w:val="sv-SE"/>
+      </w:pPr>
+      <w:r>
+        <w:lang w:val="sv-SE"/>
         <w:t xml:space="preserve">Nomor </w:t>
       </w:r>
       <w:r>
-        <w:rPr>
-          <w:lang w:val="sv-SE"/>
-        </w:rPr>
-        <w:tab/>
-      </w:r>
-      <w:r>
-        <w:rPr>
-          <w:lang w:val="sv-SE"/>
-        </w:rPr>
+        <w:lang w:val="sv-SE"/>
+      </w:r>
+      <w:r>
+        <w:lang w:val="sv-SE"/>
         <w:t xml:space="preserve">: Istimewa </w:t>
       </w:r>
       <w:r>
-        <w:rPr>
-          <w:lang w:val="sv-SE"/>
-        </w:rPr>
-        <w:tab/>
-      </w:r>
-      <w:r>
-        <w:rPr>
-          <w:lang w:val="sv-SE"/>
-        </w:rPr>
-        <w:tab/>
-      </w:r>
-      <w:r>
-        <w:rPr>
-          <w:lang w:val="sv-SE"/>
-        </w:rPr>
-        <w:tab/>
-      </w:r>
-      <w:r>
-        <w:rPr>
-          <w:lang w:val="sv-SE"/>
-        </w:rPr>
-        <w:tab/>
-      </w:r>
-      <w:r>
-        <w:rPr>
-          <w:lang w:val="sv-SE"/>
-        </w:rPr>
+        <w:lang w:val="sv-SE"/>
+      </w:r>
+      <w:r>
+        <w:lang w:val="sv-SE"/>
+      </w:r>
+      <w:r>
+        <w:lang w:val="sv-SE"/>
+      </w:r>
+      <w:r>
+        <w:lang w:val="sv-SE"/>
+      </w:r>
+      <w:r>
+        <w:lang w:val="sv-SE"/>
         <w:t xml:space="preserve">      </w:t>
       </w:r>
       <w:r>
-        <w:rPr>
-          <w:lang w:val="sv-SE"/>
-        </w:rPr>
-        <w:t>Lhokseumawe,</w:t>
-      </w:r>
-      <w:r>
-        <w:rPr>
-          <w:lang w:val="sv-SE"/>
-        </w:rPr>
+        <w:lang w:val="sv-SE"/>
+        <w:t xml:space="preserve">Lhokseumawe,</w:t>
+      </w:r>
+      <w:r>
+        <w:lang w:val="sv-SE"/>
         <w:t xml:space="preserve"> </w:t>
       </w:r>
       <w:r>
-        <w:rPr>
-          <w:color w:val="EE0000"/>
-          <w:lang w:val="sv-SE"/>
-        </w:rPr>
-        <w:t>{{Tanggal}}</w:t>
-      </w:r>
-    </w:p>
-    <w:p>
-      <w:pPr>
-        <w:tabs>
-          <w:tab w:val="left" w:pos="1985"/>
-        </w:tabs>
+        <w:color w:val="EE0000"/>
+        <w:lang w:val="sv-SE"/>
+        <w:t xml:space="preserve">{{Tanggal}}</w:t>
+      </w:r>
+    </w:p>
+    <w:p>
+      <w:pPr>
         <w:ind w:left="567"/>
-        <w:rPr>
-          <w:lang w:val="sv-SE"/>
-        </w:rPr>
-      </w:pPr>
-      <w:r>
-        <w:rPr>
-          <w:lang w:val="sv-SE"/>
-        </w:rPr>
+        <w:lang w:val="sv-SE"/>
+      </w:pPr>
+      <w:r>
+        <w:lang w:val="sv-SE"/>
         <w:t xml:space="preserve">Lampiran </w:t>
       </w:r>
       <w:r>
-        <w:rPr>
-          <w:lang w:val="sv-SE"/>
-        </w:rPr>
-        <w:tab/>
-      </w:r>
-      <w:r>
-        <w:rPr>
-          <w:lang w:val="sv-SE"/>
-        </w:rPr>
+        <w:lang w:val="sv-SE"/>
+      </w:r>
+      <w:r>
+        <w:lang w:val="sv-SE"/>
         <w:t xml:space="preserve">: 1 (satu) berkas </w:t>
       </w:r>
     </w:p>
     <w:p>
       <w:pPr>
-        <w:tabs>
-          <w:tab w:val="left" w:pos="1985"/>
-        </w:tabs>
         <w:ind w:left="567"/>
-        <w:rPr>
-          <w:lang w:val="sv-SE"/>
-        </w:rPr>
-      </w:pPr>
-      <w:r>
-        <w:rPr>
-          <w:lang w:val="sv-SE"/>
-        </w:rPr>
+        <w:lang w:val="sv-SE"/>
+      </w:pPr>
+      <w:r>
+        <w:lang w:val="sv-SE"/>
         <w:t xml:space="preserve">Hal </w:t>
       </w:r>
       <w:r>
-        <w:rPr>
-          <w:lang w:val="sv-SE"/>
-        </w:rPr>
-        <w:tab/>
-      </w:r>
-      <w:r>
-        <w:rPr>
-          <w:lang w:val="sv-SE"/>
-        </w:rPr>
+        <w:lang w:val="sv-SE"/>
+      </w:r>
+      <w:r>
+        <w:lang w:val="sv-SE"/>
         <w:t xml:space="preserve">: </w:t>
       </w:r>
       <w:r>
-        <w:rPr>
-          <w:color w:val="EE0000"/>
-          <w:lang w:val="sv-SE"/>
-        </w:rPr>
+        <w:color w:val="EE0000"/>
+        <w:lang w:val="sv-SE"/>
         <w:t xml:space="preserve">Undangan Seminar </w:t>
       </w:r>
     </w:p>
     <w:p>
       <w:pPr>
-        <w:tabs>
-          <w:tab w:val="left" w:pos="1985"/>
-        </w:tabs>
         <w:ind w:left="567"/>
-        <w:rPr>
-          <w:lang w:val="sv-SE"/>
-        </w:rPr>
-      </w:pPr>
-    </w:p>
-    <w:p>
-      <w:pPr>
-        <w:tabs>
-          <w:tab w:val="left" w:pos="1985"/>
-        </w:tabs>
+        <w:lang w:val="sv-SE"/>
+      </w:pPr>
+    </w:p>
+    <w:p>
+      <w:pPr>
         <w:ind w:left="567"/>
-        <w:rPr>
-          <w:lang w:val="sv-SE"/>
-        </w:rPr>
-      </w:pPr>
-      <w:r>
-        <w:rPr>
-          <w:lang w:val="sv-SE"/>
-        </w:rPr>
+        <w:lang w:val="sv-SE"/>
+      </w:pPr>
+      <w:r>
+        <w:lang w:val="sv-SE"/>
         <w:t xml:space="preserve">Yth. Bapak/Ibu </w:t>
       </w:r>
       <w:r>
-        <w:rPr>
-          <w:color w:val="EE0000"/>
-          <w:lang w:val="sv-SE"/>
-        </w:rPr>
+        <w:color w:val="EE0000"/>
+        <w:lang w:val="sv-SE"/>
         <w:t xml:space="preserve">Perangkat Seminar </w:t>
       </w:r>
     </w:p>
     <w:p>
       <w:pPr>
-        <w:tabs>
-          <w:tab w:val="left" w:pos="1985"/>
-        </w:tabs>
         <w:ind w:left="567"/>
-        <w:rPr>
-          <w:lang w:val="sv-SE"/>
-        </w:rPr>
-      </w:pPr>
-      <w:r>
-        <w:rPr>
-          <w:lang w:val="sv-SE"/>
-        </w:rPr>
+        <w:lang w:val="sv-SE"/>
+      </w:pPr>
+      <w:r>
+        <w:lang w:val="sv-SE"/>
         <w:t xml:space="preserve">di Tempat </w:t>
       </w:r>
     </w:p>
     <w:p>
       <w:pPr>
-        <w:tabs>
-          <w:tab w:val="left" w:pos="1985"/>
-        </w:tabs>
         <w:ind w:left="567"/>
-        <w:rPr>
-          <w:lang w:val="sv-SE"/>
-        </w:rPr>
-      </w:pPr>
-    </w:p>
-    <w:p>
-      <w:pPr>
-        <w:tabs>
-          <w:tab w:val="left" w:pos="1985"/>
-        </w:tabs>
+        <w:lang w:val="sv-SE"/>
+      </w:pPr>
+    </w:p>
+    <w:p>
+      <w:pPr>
         <w:ind w:left="567"/>
-        <w:rPr>
-          <w:lang w:val="sv-SE"/>
-        </w:rPr>
-      </w:pPr>
-      <w:r>
-        <w:rPr>
-          <w:lang w:val="sv-SE"/>
-        </w:rPr>
+        <w:lang w:val="sv-SE"/>
+      </w:pPr>
+      <w:r>
+        <w:lang w:val="sv-SE"/>
         <w:t xml:space="preserve">Dengan hormat, </w:t>
       </w:r>
     </w:p>
     <w:p>
       <w:pPr>
-        <w:tabs>
-          <w:tab w:val="left" w:pos="1985"/>
-        </w:tabs>
         <w:ind w:left="567" w:right="617"/>
         <w:jc w:val="both"/>
-        <w:rPr>
-          <w:lang w:val="sv-SE"/>
-        </w:rPr>
-      </w:pPr>
-      <w:r>
-        <w:rPr>
-          <w:lang w:val="sv-SE"/>
-        </w:rPr>
+        <w:lang w:val="sv-SE"/>
+      </w:pPr>
+      <w:r>
+        <w:lang w:val="sv-SE"/>
         <w:t xml:space="preserve">Sehubungan dengan pelaksanaan Seminar Proposal </w:t>
       </w:r>
       <w:r>
-        <w:rPr>
-          <w:color w:val="EE0000"/>
-          <w:lang w:val="sv-SE"/>
-        </w:rPr>
-        <w:t>Tugas akhir</w:t>
-      </w:r>
-      <w:r>
-        <w:rPr>
-          <w:lang w:val="sv-SE"/>
-        </w:rPr>
-        <w:t>/</w:t>
-      </w:r>
-      <w:r>
-        <w:rPr>
-          <w:color w:val="EE0000"/>
-          <w:lang w:val="sv-SE"/>
-        </w:rPr>
-        <w:t>Skripsi</w:t>
-      </w:r>
-      <w:r>
-        <w:rPr>
-          <w:lang w:val="sv-SE"/>
-        </w:rPr>
+        <w:color w:val="EE0000"/>
+        <w:lang w:val="sv-SE"/>
+        <w:t xml:space="preserve">Tugas akhir</w:t>
+      </w:r>
+      <w:r>
+        <w:lang w:val="sv-SE"/>
+        <w:t xml:space="preserve">/</w:t>
+      </w:r>
+      <w:r>
+        <w:color w:val="EE0000"/>
+        <w:lang w:val="sv-SE"/>
+        <w:t xml:space="preserve">Skripsi</w:t>
+      </w:r>
+      <w:r>
+        <w:lang w:val="sv-SE"/>
         <w:t xml:space="preserve"> </w:t>
       </w:r>
       <w:r>
-        <w:rPr>
-          <w:lang w:val="sv-SE"/>
-        </w:rPr>
+        <w:lang w:val="sv-SE"/>
         <w:t xml:space="preserve">Mahasiswa semester </w:t>
       </w:r>
       <w:r>
-        <w:rPr>
-          <w:color w:val="EE0000"/>
-          <w:lang w:val="sv-SE"/>
-        </w:rPr>
-        <w:t>V</w:t>
-      </w:r>
-      <w:r>
-        <w:rPr>
-          <w:lang w:val="sv-SE"/>
-        </w:rPr>
-        <w:t>/</w:t>
-      </w:r>
-      <w:r>
-        <w:rPr>
-          <w:color w:val="EE0000"/>
-          <w:lang w:val="sv-SE"/>
-        </w:rPr>
-        <w:t>VII</w:t>
-      </w:r>
-      <w:r>
-        <w:rPr>
-          <w:lang w:val="sv-SE"/>
-        </w:rPr>
+        <w:color w:val="EE0000"/>
+        <w:lang w:val="sv-SE"/>
+        <w:t xml:space="preserve">V</w:t>
+      </w:r>
+      <w:r>
+        <w:lang w:val="sv-SE"/>
+        <w:t xml:space="preserve">/</w:t>
+      </w:r>
+      <w:r>
+        <w:color w:val="EE0000"/>
+        <w:lang w:val="sv-SE"/>
+        <w:t xml:space="preserve">VII</w:t>
+      </w:r>
+      <w:r>
+        <w:lang w:val="sv-SE"/>
         <w:t xml:space="preserve"> </w:t>
       </w:r>
       <w:r>
-        <w:rPr>
-          <w:color w:val="EE0000"/>
-          <w:lang w:val="sv-SE"/>
-        </w:rPr>
+        <w:color w:val="EE0000"/>
+        <w:lang w:val="sv-SE"/>
         <w:t xml:space="preserve">Program Studi </w:t>
       </w:r>
       <w:r>
-        <w:rPr>
-          <w:color w:val="EE0000"/>
-          <w:lang w:val="sv-SE"/>
-        </w:rPr>
-        <w:t>D-III/</w:t>
-      </w:r>
-      <w:r>
-        <w:rPr>
-          <w:color w:val="EE0000"/>
-          <w:lang w:val="sv-SE"/>
-        </w:rPr>
+        <w:color w:val="EE0000"/>
+        <w:lang w:val="sv-SE"/>
+        <w:t xml:space="preserve">D-III/</w:t>
+      </w:r>
+      <w:r>
+        <w:color w:val="EE0000"/>
+        <w:lang w:val="sv-SE"/>
         <w:t xml:space="preserve">D-IV </w:t>
       </w:r>
       <w:r>
-        <w:rPr>
-          <w:color w:val="EE0000"/>
-          <w:lang w:val="sv-SE"/>
-        </w:rPr>
+        <w:color w:val="EE0000"/>
+        <w:lang w:val="sv-SE"/>
         <w:t xml:space="preserve">Teknologi </w:t>
       </w:r>
       <w:r>
-        <w:rPr>
-          <w:color w:val="EE0000"/>
-          <w:lang w:val="sv-SE"/>
-        </w:rPr>
+        <w:color w:val="EE0000"/>
+        <w:lang w:val="sv-SE"/>
         <w:t xml:space="preserve">Rekayasa </w:t>
       </w:r>
       <w:r>
-        <w:rPr>
-          <w:color w:val="EE0000"/>
-          <w:lang w:val="sv-SE"/>
-        </w:rPr>
-        <w:t>Konstruksi Jalan dan Jembatan</w:t>
-      </w:r>
-      <w:r>
-        <w:rPr>
-          <w:lang w:val="sv-SE"/>
-        </w:rPr>
+        <w:color w:val="EE0000"/>
+        <w:lang w:val="sv-SE"/>
+        <w:t xml:space="preserve">Konstruksi Jalan dan Jembatan</w:t>
+      </w:r>
+      <w:r>
+        <w:lang w:val="sv-SE"/>
         <w:t xml:space="preserve"> </w:t>
       </w:r>
       <w:r>
-        <w:rPr>
-          <w:lang w:val="sv-SE"/>
-        </w:rPr>
+        <w:lang w:val="sv-SE"/>
         <w:t xml:space="preserve">Tahun Akademik </w:t>
       </w:r>
       <w:r>
-        <w:rPr>
-          <w:color w:val="EE0000"/>
-          <w:lang w:val="sv-SE"/>
-        </w:rPr>
-        <w:t>{{TahunAkademik}}</w:t>
-      </w:r>
-      <w:r>
-        <w:rPr>
-          <w:color w:val="EE0000"/>
-          <w:lang w:val="sv-SE"/>
-        </w:rPr>
+        <w:color w:val="EE0000"/>
+        <w:lang w:val="sv-SE"/>
+        <w:t xml:space="preserve">{{TahunAkademik}}</w:t>
+      </w:r>
+      <w:r>
+        <w:color w:val="EE0000"/>
+        <w:lang w:val="sv-SE"/>
         <w:t xml:space="preserve"> </w:t>
       </w:r>
       <w:r>
-        <w:rPr>
-          <w:lang w:val="sv-SE"/>
-        </w:rPr>
+        <w:lang w:val="sv-SE"/>
         <w:t xml:space="preserve">maka dengan ini Kepala Program </w:t>
       </w:r>
       <w:r>
-        <w:rPr>
-          <w:color w:val="EE0000"/>
-          <w:lang w:val="sv-SE"/>
-        </w:rPr>
-        <w:t>D-IV Teknologi Konstruksi Rekayasa Jalan dan Jembatan</w:t>
-      </w:r>
-      <w:r>
-        <w:rPr>
-          <w:lang w:val="sv-SE"/>
-        </w:rPr>
+        <w:color w:val="EE0000"/>
+        <w:lang w:val="sv-SE"/>
+        <w:t xml:space="preserve">D-IV Teknologi Konstruksi Rekayasa Jalan dan Jembatan</w:t>
+      </w:r>
+      <w:r>
+        <w:lang w:val="sv-SE"/>
         <w:t xml:space="preserve"> mengundang Bapak/Ibu untuk bersedia hadir pada </w:t>
       </w:r>
       <w:r>
-        <w:rPr>
-          <w:color w:val="EE0000"/>
-          <w:lang w:val="sv-SE"/>
-        </w:rPr>
+        <w:color w:val="EE0000"/>
+        <w:lang w:val="sv-SE"/>
         <w:t xml:space="preserve">Seminar Proposal </w:t>
       </w:r>
       <w:r>
-        <w:rPr>
-          <w:color w:val="EE0000"/>
-          <w:lang w:val="sv-SE"/>
-        </w:rPr>
-        <w:t>Tugas Akhir/</w:t>
-      </w:r>
-      <w:r>
-        <w:rPr>
-          <w:color w:val="EE0000"/>
-          <w:lang w:val="sv-SE"/>
-        </w:rPr>
-        <w:t>Skripsi</w:t>
-      </w:r>
-      <w:r>
-        <w:rPr>
-          <w:color w:val="EE0000"/>
-          <w:lang w:val="sv-SE"/>
-        </w:rPr>
+        <w:color w:val="EE0000"/>
+        <w:lang w:val="sv-SE"/>
+        <w:t xml:space="preserve">Tugas Akhir/</w:t>
+      </w:r>
+      <w:r>
+        <w:color w:val="EE0000"/>
+        <w:lang w:val="sv-SE"/>
+        <w:t xml:space="preserve">Skripsi</w:t>
+      </w:r>
+      <w:r>
+        <w:color w:val="EE0000"/>
+        <w:lang w:val="sv-SE"/>
         <w:t xml:space="preserve"> </w:t>
       </w:r>
       <w:r>
-        <w:rPr>
-          <w:lang w:val="sv-SE"/>
-        </w:rPr>
-        <w:t>mahasiswa:</w:t>
-      </w:r>
-    </w:p>
-    <w:p>
-      <w:pPr>
-        <w:tabs>
-          <w:tab w:val="left" w:pos="1985"/>
-        </w:tabs>
+        <w:lang w:val="sv-SE"/>
+        <w:t xml:space="preserve">mahasiswa:</w:t>
+      </w:r>
+    </w:p>
+    <w:p>
+      <w:pPr>
         <w:ind w:left="567"/>
-        <w:rPr>
-          <w:lang w:val="sv-SE"/>
-        </w:rPr>
-      </w:pPr>
-    </w:p>
-    <w:p>
-      <w:pPr>
-        <w:tabs>
-          <w:tab w:val="left" w:pos="1418"/>
-          <w:tab w:val="left" w:pos="1985"/>
-        </w:tabs>
+        <w:lang w:val="sv-SE"/>
+      </w:pPr>
+    </w:p>
+    <w:p>
+      <w:pPr>
         <w:ind w:left="567"/>
-        <w:rPr>
-          <w:lang w:val="sv-SE"/>
-        </w:rPr>
-      </w:pPr>
-      <w:r>
-        <w:rPr>
-          <w:lang w:val="sv-SE"/>
-        </w:rPr>
-        <w:t xml:space="preserve">
-          Nama : {{Nama}}
-          <w:br/>
-          NIM : {{NIM}}
-          <w:br/>
-          Hari/Tanggal : {{HariTanggal}}
-          <w:br/>
-          Waktu : {{Waktu}}
-          <w:br/>
-          Ruang : {{Ruang}}
-          <w:br/>
-          Judul : {{Judul}}Susunan perangkat Seminar adalah sebagai berikut:
-        </w:t>
-      </w:r>
-    </w:p>
-    <w:tbl>
-      <w:tblPr>
-        <w:tblW w:w="9498" w:type="dxa"/>
-        <w:tblInd w:w="675" w:type="dxa"/>
-        <w:tblBorders>
-          <w:top w:val="single" w:sz="4" w:space="0" w:color="auto"/>
-          <w:left w:val="single" w:sz="4" w:space="0" w:color="auto"/>
-          <w:bottom w:val="single" w:sz="4" w:space="0" w:color="auto"/>
-          <w:right w:val="single" w:sz="4" w:space="0" w:color="auto"/>
-          <w:insideH w:val="single" w:sz="4" w:space="0" w:color="auto"/>
-          <w:insideV w:val="single" w:sz="4" w:space="0" w:color="auto"/>
-        </w:tblBorders>
-        <w:tblLayout w:type="fixed"/>
-        <w:tblLook w:val="0000" w:firstRow="0" w:lastRow="0" w:firstColumn="0" w:lastColumn="0" w:noHBand="0" w:noVBand="0"/>
-      </w:tblPr>
-      <w:tblGrid>
-        <w:gridCol w:w="534"/>
-        <w:gridCol w:w="3861"/>
-        <w:gridCol w:w="2268"/>
-        <w:gridCol w:w="2835"/>
-      </w:tblGrid>
-      <w:tr>
-        <w:trPr>
-          <w:trHeight w:val="89"/>
-        </w:trPr>
-        <w:tc>
-          <w:tcPr>
-            <w:tcW w:w="534" w:type="dxa"/>
-            <w:shd w:val="clear" w:color="auto" w:fill="FFC000"/>
-          </w:tcPr>
-          <w:p>
-            <w:pPr>
-              <w:jc w:val="center"/>
-              <w:rPr>
-                <w:sz w:val="22"/>
-                <w:szCs w:val="22"/>
-                <w:lang w:val="sv-SE"/>
-              </w:rPr>
-            </w:pPr>
-            <w:r>
-              <w:rPr>
-                <w:b/>
-                <w:bCs/>
-                <w:sz w:val="22"/>
-                <w:szCs w:val="22"/>
-                <w:lang w:val="sv-SE"/>
-              </w:rPr>
-              <w:t>No</w:t>
-            </w:r>
-          </w:p>
-        </w:tc>
-        <w:tc>
-          <w:tcPr>
-            <w:tcW w:w="3861" w:type="dxa"/>
-            <w:shd w:val="clear" w:color="auto" w:fill="FFC000"/>
-          </w:tcPr>
-          <w:p>
-            <w:pPr>
-              <w:jc w:val="center"/>
-              <w:rPr>
-                <w:b/>
-                <w:bCs/>
-                <w:sz w:val="22"/>
-                <w:szCs w:val="22"/>
-                <w:lang w:val="en-ID"/>
-              </w:rPr>
-            </w:pPr>
-            <w:r>
-              <w:rPr>
-                <w:b/>
-                <w:bCs/>
-                <w:sz w:val="22"/>
-                <w:szCs w:val="22"/>
-                <w:lang w:val="en-ID"/>
-              </w:rPr>
-              <w:t>Nama</w:t>
-            </w:r>
-          </w:p>
-        </w:tc>
-        <w:tc>
-          <w:tcPr>
-            <w:tcW w:w="2268" w:type="dxa"/>
-            <w:shd w:val="clear" w:color="auto" w:fill="FFC000"/>
-          </w:tcPr>
-          <w:p>
-            <w:pPr>
-              <w:jc w:val="center"/>
-              <w:rPr>
-                <w:sz w:val="22"/>
-                <w:szCs w:val="22"/>
-                <w:lang w:val="en-ID"/>
-              </w:rPr>
-            </w:pPr>
-            <w:r>
-              <w:rPr>
-                <w:b/>
-                <w:bCs/>
-                <w:sz w:val="22"/>
-                <w:szCs w:val="22"/>
-                <w:lang w:val="en-ID"/>
-              </w:rPr>
-              <w:t>NIP</w:t>
-            </w:r>
-          </w:p>
-        </w:tc>
-        <w:tc>
-          <w:tcPr>
-            <w:tcW w:w="2835" w:type="dxa"/>
-            <w:shd w:val="clear" w:color="auto" w:fill="FFC000"/>
-          </w:tcPr>
-          <w:p>
-            <w:pPr>
-              <w:jc w:val="center"/>
-              <w:rPr>
-                <w:b/>
-                <w:bCs/>
-                <w:sz w:val="22"/>
-                <w:szCs w:val="22"/>
-                <w:lang w:val="en-ID"/>
-              </w:rPr>
-            </w:pPr>
-            <w:proofErr w:type="spellStart"/>
-            <w:r>
-              <w:rPr>
-                <w:b/>
-                <w:bCs/>
-                <w:sz w:val="22"/>
-                <w:szCs w:val="22"/>
-                <w:lang w:val="en-ID"/>
-              </w:rPr>
-              <w:t>Keterangan</w:t>
-            </w:r>
-            <w:proofErr w:type="spellEnd"/>
-          </w:p>
-        </w:tc>
-      </w:tr>
-      <w:tr>
-        <w:trPr>
-          <w:trHeight w:val="567"/>
-        </w:trPr>
-        <w:tc>
-          <w:tcPr>
-            <w:tcW w:w="534" w:type="dxa"/>
-            <w:vAlign w:val="center"/>
-          </w:tcPr>
-          <w:p>
-            <w:pPr>
-              <w:ind w:left="-15"/>
-              <w:jc w:val="center"/>
-              <w:rPr>
-                <w:sz w:val="22"/>
-                <w:szCs w:val="22"/>
-                <w:lang w:val="en-ID"/>
-              </w:rPr>
-            </w:pPr>
-            <w:r>
-              <w:rPr>
-                <w:sz w:val="22"/>
-                <w:szCs w:val="22"/>
-                <w:lang w:val="en-ID"/>
-              </w:rPr>
-              <w:t>1</w:t>
-            </w:r>
-          </w:p>
-        </w:tc>
-        <w:tc>
-          <w:tcPr>
-            <w:tcW w:w="3861" w:type="dxa"/>
-            <w:vAlign w:val="center"/>
-          </w:tcPr>
-          <w:p>
-            <w:pPr>
-              <w:rPr>
-                <w:sz w:val="22"/>
-                <w:szCs w:val="22"/>
-                <w:lang w:val="en-ID"/>
-              </w:rPr>
-            </w:pPr>
-            <w:r>
-              <w:rPr>
-                <w:sz w:val="22"/>
-                <w:szCs w:val="22"/>
-                <w:lang w:val="en-ID"/>
-              </w:rPr>
-              <w:t xml:space="preserve">Dr. Rizal Syahyadi, S.T., </w:t>
-            </w:r>
-            <w:proofErr w:type="spellStart"/>
-            <w:r>
-              <w:rPr>
-                <w:sz w:val="22"/>
-                <w:szCs w:val="22"/>
-                <w:lang w:val="en-ID"/>
-              </w:rPr>
-              <w:t>M.Eng.Sc</w:t>
-            </w:r>
-            <w:proofErr w:type="spellEnd"/>
-            <w:r>
-              <w:rPr>
-                <w:sz w:val="22"/>
-                <w:szCs w:val="22"/>
-                <w:lang w:val="en-ID"/>
-              </w:rPr>
-              <w:t>.</w:t>
-            </w:r>
-            <w:r>
-              <w:rPr>
-                <w:sz w:val="22"/>
-                <w:szCs w:val="22"/>
-                <w:lang w:val="en-ID"/>
-              </w:rPr>
-              <w:t xml:space="preserve">, IPM, </w:t>
-            </w:r>
-            <w:proofErr w:type="spellStart"/>
-            <w:r>
-              <w:rPr>
-                <w:sz w:val="22"/>
-                <w:szCs w:val="22"/>
-                <w:lang w:val="en-ID"/>
-              </w:rPr>
-              <w:t>ASEAN.Eng</w:t>
-            </w:r>
-            <w:proofErr w:type="spellEnd"/>
-            <w:r>
-              <w:rPr>
-                <w:sz w:val="22"/>
-                <w:szCs w:val="22"/>
-                <w:lang w:val="en-ID"/>
-              </w:rPr>
-              <w:t xml:space="preserve">., </w:t>
-            </w:r>
-            <w:proofErr w:type="spellStart"/>
-            <w:r>
-              <w:rPr>
-                <w:sz w:val="22"/>
-                <w:szCs w:val="22"/>
-                <w:lang w:val="en-ID"/>
-              </w:rPr>
-              <w:t>APEC.Eng</w:t>
-            </w:r>
-            <w:proofErr w:type="spellEnd"/>
-          </w:p>
-        </w:tc>
-        <w:tc>
-          <w:tcPr>
-            <w:tcW w:w="2268" w:type="dxa"/>
-            <w:vAlign w:val="center"/>
-          </w:tcPr>
-          <w:p>
-            <w:pPr>
-              <w:rPr>
-                <w:sz w:val="22"/>
-                <w:szCs w:val="22"/>
-                <w:lang w:val="en-ID"/>
-              </w:rPr>
-            </w:pPr>
-          </w:p>
-        </w:tc>
-        <w:tc>
-          <w:tcPr>
-            <w:tcW w:w="2835" w:type="dxa"/>
-            <w:vAlign w:val="center"/>
-          </w:tcPr>
-          <w:p>
-            <w:pPr>
-              <w:jc w:val="center"/>
-              <w:rPr>
-                <w:sz w:val="22"/>
-                <w:szCs w:val="22"/>
-                <w:lang w:val="en-ID"/>
-              </w:rPr>
-            </w:pPr>
-            <w:proofErr w:type="spellStart"/>
-            <w:r>
-              <w:rPr>
-                <w:sz w:val="22"/>
-                <w:szCs w:val="22"/>
-                <w:lang w:val="en-ID"/>
-              </w:rPr>
-              <w:t>Ketua</w:t>
-            </w:r>
-            <w:proofErr w:type="spellEnd"/>
-          </w:p>
-        </w:tc>
-      </w:tr>
-      <w:tr>
-        <w:trPr>
-          <w:trHeight w:val="567"/>
-        </w:trPr>
-        <w:tc>
-          <w:tcPr>
-            <w:tcW w:w="534" w:type="dxa"/>
-            <w:vAlign w:val="center"/>
-          </w:tcPr>
-          <w:p>
-            <w:pPr>
-              <w:ind w:left="-15"/>
-              <w:jc w:val="center"/>
-              <w:rPr>
-                <w:sz w:val="22"/>
-                <w:szCs w:val="22"/>
-                <w:lang w:val="en-ID"/>
-              </w:rPr>
-            </w:pPr>
-            <w:r>
-              <w:rPr>
-                <w:sz w:val="22"/>
-                <w:szCs w:val="22"/>
-                <w:lang w:val="en-ID"/>
-              </w:rPr>
-              <w:t>2</w:t>
-            </w:r>
-          </w:p>
-        </w:tc>
-        <w:tc>
-          <w:tcPr>
-            <w:tcW w:w="3861" w:type="dxa"/>
-            <w:vAlign w:val="center"/>
-          </w:tcPr>
-          <w:p>
-            <w:pPr>
-              <w:rPr>
-                <w:sz w:val="22"/>
-                <w:szCs w:val="22"/>
-                <w:lang w:val="en-ID"/>
-              </w:rPr>
-            </w:pPr>
-            <w:r>
-              <w:rPr>
-                <w:sz w:val="22"/>
-                <w:szCs w:val="22"/>
-                <w:lang w:val="en-ID"/>
-              </w:rPr>
-              <w:t xml:space="preserve">Nurul Hidayati Binti </w:t>
-            </w:r>
-            <w:proofErr w:type="spellStart"/>
-            <w:r>
-              <w:rPr>
-                <w:sz w:val="22"/>
-                <w:szCs w:val="22"/>
-                <w:lang w:val="en-ID"/>
-              </w:rPr>
-              <w:t>Saidan</w:t>
-            </w:r>
-            <w:proofErr w:type="spellEnd"/>
-            <w:r>
-              <w:rPr>
-                <w:sz w:val="22"/>
-                <w:szCs w:val="22"/>
-                <w:lang w:val="en-ID"/>
-              </w:rPr>
-              <w:t>, S.T., M.T.</w:t>
-            </w:r>
-          </w:p>
-        </w:tc>
-        <w:tc>
-          <w:tcPr>
-            <w:tcW w:w="2268" w:type="dxa"/>
-            <w:vAlign w:val="center"/>
-          </w:tcPr>
-          <w:p>
-            <w:pPr>
-              <w:rPr>
-                <w:sz w:val="22"/>
-                <w:szCs w:val="22"/>
-                <w:lang w:val="en-ID"/>
-              </w:rPr>
-            </w:pPr>
-            <w:r>
-              <w:rPr>
-                <w:sz w:val="22"/>
-                <w:szCs w:val="22"/>
-                <w:lang w:val="en-ID"/>
-              </w:rPr>
-              <w:t>198912192025062001</w:t>
-            </w:r>
-          </w:p>
-        </w:tc>
-        <w:tc>
-          <w:tcPr>
-            <w:tcW w:w="2835" w:type="dxa"/>
-            <w:vAlign w:val="center"/>
-          </w:tcPr>
-          <w:p>
-            <w:pPr>
-              <w:jc w:val="center"/>
-              <w:rPr>
-                <w:sz w:val="22"/>
-                <w:szCs w:val="22"/>
-                <w:lang w:val="en-ID"/>
-              </w:rPr>
-            </w:pPr>
-            <w:proofErr w:type="spellStart"/>
-            <w:r>
-              <w:rPr>
-                <w:sz w:val="22"/>
-                <w:szCs w:val="22"/>
-                <w:lang w:val="en-ID"/>
-              </w:rPr>
-              <w:t>Sekretaris</w:t>
-            </w:r>
-            <w:proofErr w:type="spellEnd"/>
-          </w:p>
-        </w:tc>
-      </w:tr>
-      <w:tr>
-        <w:trPr>
-          <w:trHeight w:val="567"/>
-        </w:trPr>
-        <w:tc>
-          <w:tcPr>
-            <w:tcW w:w="534" w:type="dxa"/>
-            <w:vAlign w:val="center"/>
-          </w:tcPr>
-          <w:p>
-            <w:pPr>
-              <w:ind w:left="-15"/>
-              <w:jc w:val="center"/>
-              <w:rPr>
-                <w:sz w:val="22"/>
-                <w:szCs w:val="22"/>
-                <w:lang w:val="en-ID"/>
-              </w:rPr>
-            </w:pPr>
-            <w:r>
-              <w:rPr>
-                <w:sz w:val="22"/>
-                <w:szCs w:val="22"/>
-                <w:lang w:val="en-ID"/>
-              </w:rPr>
-              <w:t>3</w:t>
-            </w:r>
-          </w:p>
-        </w:tc>
-        <w:tc>
-          <w:tcPr>
-            <w:tcW w:w="3861" w:type="dxa"/>
-            <w:vAlign w:val="center"/>
-          </w:tcPr>
-          <w:p>
-            <w:pPr>
-              <w:rPr>
-                <w:sz w:val="22"/>
-                <w:szCs w:val="22"/>
-                <w:lang w:val="sv-SE"/>
-              </w:rPr>
-            </w:pPr>
-            <w:r>
-              <w:rPr>
-                <w:sz w:val="22"/>
-                <w:szCs w:val="22"/>
-                <w:lang w:val="sv-SE"/>
-              </w:rPr>
-              <w:t>Ir.Syarifah Keumala Intan, S</w:t>
-            </w:r>
-            <w:r>
-              <w:rPr>
-                <w:sz w:val="22"/>
-                <w:szCs w:val="22"/>
-                <w:lang w:val="sv-SE"/>
-              </w:rPr>
-              <w:t>.T., M.T.</w:t>
-            </w:r>
-          </w:p>
-        </w:tc>
-        <w:tc>
-          <w:tcPr>
-            <w:tcW w:w="2268" w:type="dxa"/>
-            <w:vAlign w:val="center"/>
-          </w:tcPr>
-          <w:p>
-            <w:pPr>
-              <w:rPr>
-                <w:sz w:val="22"/>
-                <w:szCs w:val="22"/>
-                <w:lang w:val="sv-SE"/>
-              </w:rPr>
-            </w:pPr>
-          </w:p>
-        </w:tc>
-        <w:tc>
-          <w:tcPr>
-            <w:tcW w:w="2835" w:type="dxa"/>
-            <w:vAlign w:val="center"/>
-          </w:tcPr>
-          <w:p>
-            <w:pPr>
-              <w:jc w:val="center"/>
-              <w:rPr>
-                <w:sz w:val="22"/>
-                <w:szCs w:val="22"/>
-                <w:lang w:val="en-ID"/>
-              </w:rPr>
-            </w:pPr>
-            <w:proofErr w:type="spellStart"/>
-            <w:r>
-              <w:rPr>
-                <w:sz w:val="22"/>
-                <w:szCs w:val="22"/>
-                <w:lang w:val="en-ID"/>
-              </w:rPr>
-              <w:t>{{Pembimbing1}}</w:t>
-            </w:r>
-          </w:p>
-        </w:tc>
-      </w:tr>
-      <w:tr>
-        <w:trPr>
-          <w:trHeight w:val="567"/>
-        </w:trPr>
-        <w:tc>
-          <w:tcPr>
-            <w:tcW w:w="534" w:type="dxa"/>
-            <w:vAlign w:val="center"/>
-          </w:tcPr>
-          <w:p>
-            <w:pPr>
-              <w:ind w:left="-15"/>
-              <w:jc w:val="center"/>
-              <w:rPr>
-                <w:sz w:val="22"/>
-                <w:szCs w:val="22"/>
-                <w:lang w:val="en-ID"/>
-              </w:rPr>
-            </w:pPr>
-            <w:r>
-              <w:rPr>
-                <w:sz w:val="22"/>
-                <w:szCs w:val="22"/>
-                <w:lang w:val="en-ID"/>
-              </w:rPr>
-              <w:t>4</w:t>
-            </w:r>
-          </w:p>
-        </w:tc>
-        <w:tc>
-          <w:tcPr>
-            <w:tcW w:w="3861" w:type="dxa"/>
-            <w:vAlign w:val="center"/>
-          </w:tcPr>
-          <w:p>
-            <w:pPr>
-              <w:rPr>
-                <w:sz w:val="22"/>
-                <w:szCs w:val="22"/>
-                <w:lang w:val="en-ID"/>
-              </w:rPr>
-            </w:pPr>
-          </w:p>
-        </w:tc>
-        <w:tc>
-          <w:tcPr>
-            <w:tcW w:w="2268" w:type="dxa"/>
-            <w:vAlign w:val="center"/>
-          </w:tcPr>
-          <w:p>
-            <w:pPr>
-              <w:rPr>
-                <w:sz w:val="22"/>
-                <w:szCs w:val="22"/>
-                <w:lang w:val="en-ID"/>
-              </w:rPr>
-            </w:pPr>
-          </w:p>
-        </w:tc>
-        <w:tc>
-          <w:tcPr>
-            <w:tcW w:w="2835" w:type="dxa"/>
-            <w:vAlign w:val="center"/>
-          </w:tcPr>
-          <w:p>
-            <w:pPr>
-              <w:jc w:val="center"/>
-              <w:rPr>
-                <w:sz w:val="22"/>
-                <w:szCs w:val="22"/>
-                <w:lang w:val="en-ID"/>
-              </w:rPr>
-            </w:pPr>
-            <w:proofErr w:type="spellStart"/>
-            <w:r>
-              <w:rPr>
-                <w:sz w:val="22"/>
-                <w:szCs w:val="22"/>
-                <w:lang w:val="en-ID"/>
-              </w:rPr>
-              <w:t>{{Pembimbing2}}</w:t>
-            </w:r>
-            <w:proofErr w:type="spellEnd"/>
-          </w:p>
-        </w:tc>
-      </w:tr>
-      <w:tr>
-        <w:trPr>
-          <w:trHeight w:val="567"/>
-        </w:trPr>
-        <w:tc>
-          <w:tcPr>
-            <w:tcW w:w="534" w:type="dxa"/>
-            <w:vAlign w:val="center"/>
-          </w:tcPr>
-          <w:p>
-            <w:pPr>
-              <w:ind w:left="-15"/>
-              <w:jc w:val="center"/>
-              <w:rPr>
-                <w:sz w:val="22"/>
-                <w:szCs w:val="22"/>
-                <w:lang w:val="en-ID"/>
-              </w:rPr>
-            </w:pPr>
-            <w:r>
-              <w:rPr>
-                <w:sz w:val="22"/>
-                <w:szCs w:val="22"/>
-                <w:lang w:val="en-ID"/>
-              </w:rPr>
-              <w:t>5</w:t>
-            </w:r>
-          </w:p>
-        </w:tc>
-        <w:tc>
-          <w:tcPr>
-            <w:tcW w:w="3861" w:type="dxa"/>
-            <w:vAlign w:val="center"/>
-          </w:tcPr>
-          <w:p>
-            <w:pPr>
-              <w:rPr>
-                <w:sz w:val="22"/>
-                <w:szCs w:val="22"/>
-                <w:lang w:val="en-ID"/>
-              </w:rPr>
-            </w:pPr>
-          </w:p>
-        </w:tc>
-        <w:tc>
-          <w:tcPr>
-            <w:tcW w:w="2268" w:type="dxa"/>
-            <w:vAlign w:val="center"/>
-          </w:tcPr>
-          <w:p>
-            <w:pPr>
-              <w:rPr>
-                <w:sz w:val="22"/>
-                <w:szCs w:val="22"/>
-                <w:lang w:val="en-ID"/>
-              </w:rPr>
-            </w:pPr>
-          </w:p>
-        </w:tc>
-        <w:tc>
-          <w:tcPr>
-            <w:tcW w:w="2835" w:type="dxa"/>
-            <w:vAlign w:val="center"/>
-          </w:tcPr>
-          <w:p>
-            <w:pPr>
-              <w:jc w:val="center"/>
-              <w:rPr>
-                <w:sz w:val="22"/>
-                <w:szCs w:val="22"/>
-                <w:lang w:val="en-ID"/>
-              </w:rPr>
-            </w:pPr>
-            <w:proofErr w:type="spellStart"/>
-            <w:r>
-              <w:rPr>
-                <w:sz w:val="22"/>
-                <w:szCs w:val="22"/>
-                <w:lang w:val="en-ID"/>
-              </w:rPr>
-              <w:t>{{Penguji1}}</w:t>
-            </w:r>
-          </w:p>
-        </w:tc>
-      </w:tr>
-      <w:tr>
-        <w:trPr>
-          <w:trHeight w:val="567"/>
-        </w:trPr>
-        <w:tc>
-          <w:tcPr>
-            <w:tcW w:w="534" w:type="dxa"/>
-            <w:vAlign w:val="center"/>
-          </w:tcPr>
-          <w:p>
-            <w:pPr>
-              <w:ind w:left="-15"/>
-              <w:jc w:val="center"/>
-              <w:rPr>
-                <w:sz w:val="22"/>
-                <w:szCs w:val="22"/>
-                <w:lang w:val="en-ID"/>
-              </w:rPr>
-            </w:pPr>
-            <w:r>
-              <w:rPr>
-                <w:sz w:val="22"/>
-                <w:szCs w:val="22"/>
-                <w:lang w:val="en-ID"/>
-              </w:rPr>
-              <w:t>6</w:t>
-            </w:r>
-          </w:p>
-        </w:tc>
-        <w:tc>
-          <w:tcPr>
-            <w:tcW w:w="3861" w:type="dxa"/>
-            <w:vAlign w:val="center"/>
-          </w:tcPr>
-          <w:p>
-            <w:pPr>
-              <w:rPr>
-                <w:sz w:val="22"/>
-                <w:szCs w:val="22"/>
-                <w:lang w:val="en-ID"/>
-              </w:rPr>
-            </w:pPr>
-          </w:p>
-        </w:tc>
-        <w:tc>
-          <w:tcPr>
-            <w:tcW w:w="2268" w:type="dxa"/>
-            <w:vAlign w:val="center"/>
-          </w:tcPr>
-          <w:p>
-            <w:pPr>
-              <w:rPr>
-                <w:sz w:val="22"/>
-                <w:szCs w:val="22"/>
-                <w:lang w:val="en-ID"/>
-              </w:rPr>
-            </w:pPr>
-          </w:p>
-        </w:tc>
-        <w:tc>
-          <w:tcPr>
-            <w:tcW w:w="2835" w:type="dxa"/>
-            <w:vAlign w:val="center"/>
-          </w:tcPr>
-          <w:p>
-            <w:pPr>
-              <w:jc w:val="center"/>
-              <w:rPr>
-                <w:sz w:val="22"/>
-                <w:szCs w:val="22"/>
-                <w:lang w:val="en-ID"/>
-              </w:rPr>
-            </w:pPr>
-            <w:proofErr w:type="spellStart"/>
-            <w:r>
-              <w:rPr>
-                <w:sz w:val="22"/>
-                <w:szCs w:val="22"/>
-                <w:lang w:val="en-ID"/>
-              </w:rPr>
-              <w:t>{{Penguji2}}</w:t>
-            </w:r>
-          </w:p>
-        </w:tc>
-      </w:tr>
-    </w:tbl>
-    <w:p>
-      <w:pPr>
-        <w:rPr>
-          <w:lang w:val="sv-SE"/>
-        </w:rPr>
+        <w:lang w:val="sv-SE"/>
+      </w:pPr>
+      <w:r>
+        <w:lang w:val="sv-SE"/>
+        <w:t xml:space="preserve">Nama : {{Nama}}</w:t>
+        <w:br/>
+        <w:t xml:space="preserve">NIM : {{NIM}}</w:t>
+        <w:br/>
+        <w:t xml:space="preserve">Hari/Tanggal : {{HariTanggal}}</w:t>
+        <w:br/>
+        <w:t xml:space="preserve">Waktu : {{Waktu}}</w:t>
+        <w:br/>
+        <w:t xml:space="preserve">Ruang : {{Ruang}}</w:t>
+        <w:br/>
+        <w:t xml:space="preserve">Judul : {{Judul}}Susunan perangkat Seminar adalah sebagai berikut:</w:t>
+      </w:r>
+    </w:p>
+    <w:left w:val="single" w:sz="4" w:space="0" w:color="auto"/>
+    <w:bottom w:val="single" w:sz="4" w:space="0" w:color="auto"/>
+    <w:insideH w:val="single" w:sz="4" w:space="0" w:color="auto"/>
+    <w:insideV w:val="single" w:sz="4" w:space="0" w:color="auto"/>
+    <w:gridCol w:w="534"/>
+    <w:gridCol w:w="3861"/>
+    <w:gridCol w:w="2268"/>
+    <w:gridCol w:w="2835"/>
+    <w:shd w:val="clear" w:color="auto" w:fill="FFC000"/>
+    <w:p>
+      <w:pPr>
+        <w:jc w:val="center"/>
+        <w:sz w:val="22"/>
+        <w:szCs w:val="22"/>
+        <w:lang w:val="sv-SE"/>
+      </w:pPr>
+      <w:r>
+        <w:b/>
+        <w:bCs/>
+        <w:sz w:val="22"/>
+        <w:szCs w:val="22"/>
+        <w:lang w:val="sv-SE"/>
+        <w:t xml:space="preserve">No</w:t>
+      </w:r>
+    </w:p>
+    <w:shd w:val="clear" w:color="auto" w:fill="FFC000"/>
+    <w:p>
+      <w:pPr>
+        <w:jc w:val="center"/>
+        <w:b/>
+        <w:bCs/>
+        <w:sz w:val="22"/>
+        <w:szCs w:val="22"/>
+        <w:lang w:val="en-ID"/>
+      </w:pPr>
+      <w:r>
+        <w:b/>
+        <w:bCs/>
+        <w:sz w:val="22"/>
+        <w:szCs w:val="22"/>
+        <w:lang w:val="en-ID"/>
+        <w:t xml:space="preserve">Nama</w:t>
+      </w:r>
+    </w:p>
+    <w:shd w:val="clear" w:color="auto" w:fill="FFC000"/>
+    <w:p>
+      <w:pPr>
+        <w:jc w:val="center"/>
+        <w:sz w:val="22"/>
+        <w:szCs w:val="22"/>
+        <w:lang w:val="en-ID"/>
+      </w:pPr>
+      <w:r>
+        <w:b/>
+        <w:bCs/>
+        <w:sz w:val="22"/>
+        <w:szCs w:val="22"/>
+        <w:lang w:val="en-ID"/>
+        <w:t xml:space="preserve">NIP</w:t>
+      </w:r>
+    </w:p>
+    <w:shd w:val="clear" w:color="auto" w:fill="FFC000"/>
+    <w:p>
+      <w:pPr>
+        <w:jc w:val="center"/>
+        <w:b/>
+        <w:bCs/>
+        <w:sz w:val="22"/>
+        <w:szCs w:val="22"/>
+        <w:lang w:val="en-ID"/>
+      </w:pPr>
+      <w:proofErr w:type="spellStart"/>
+      <w:r>
+        <w:b/>
+        <w:bCs/>
+        <w:sz w:val="22"/>
+        <w:szCs w:val="22"/>
+        <w:lang w:val="en-ID"/>
+        <w:t xml:space="preserve">Keterangan</w:t>
+      </w:r>
+      <w:proofErr w:type="spellEnd"/>
+    </w:p>
+    <w:vAlign w:val="center"/>
+    <w:p>
+      <w:pPr>
+        <w:ind w:left="-15"/>
+        <w:jc w:val="center"/>
+        <w:sz w:val="22"/>
+        <w:szCs w:val="22"/>
+        <w:lang w:val="en-ID"/>
+      </w:pPr>
+      <w:r>
+        <w:sz w:val="22"/>
+        <w:szCs w:val="22"/>
+        <w:lang w:val="en-ID"/>
+        <w:t xml:space="preserve">1</w:t>
+      </w:r>
+    </w:p>
+    <w:vAlign w:val="center"/>
+    <w:p>
+      <w:pPr>
+        <w:sz w:val="22"/>
+        <w:szCs w:val="22"/>
+        <w:lang w:val="en-ID"/>
+      </w:pPr>
+      <w:r>
+        <w:sz w:val="22"/>
+        <w:szCs w:val="22"/>
+        <w:lang w:val="en-ID"/>
+        <w:t xml:space="preserve">Dr. Rizal Syahyadi, S.T., </w:t>
+      </w:r>
+      <w:proofErr w:type="spellStart"/>
+      <w:r>
+        <w:sz w:val="22"/>
+        <w:szCs w:val="22"/>
+        <w:lang w:val="en-ID"/>
+        <w:t xml:space="preserve">M.Eng.Sc</w:t>
+      </w:r>
+      <w:proofErr w:type="spellEnd"/>
+      <w:r>
+        <w:sz w:val="22"/>
+        <w:szCs w:val="22"/>
+        <w:lang w:val="en-ID"/>
+        <w:t xml:space="preserve">.</w:t>
+      </w:r>
+      <w:r>
+        <w:sz w:val="22"/>
+        <w:szCs w:val="22"/>
+        <w:lang w:val="en-ID"/>
+        <w:t xml:space="preserve">, IPM, </w:t>
+      </w:r>
+      <w:proofErr w:type="spellStart"/>
+      <w:r>
+        <w:sz w:val="22"/>
+        <w:szCs w:val="22"/>
+        <w:lang w:val="en-ID"/>
+        <w:t xml:space="preserve">ASEAN.Eng</w:t>
+      </w:r>
+      <w:proofErr w:type="spellEnd"/>
+      <w:r>
+        <w:sz w:val="22"/>
+        <w:szCs w:val="22"/>
+        <w:lang w:val="en-ID"/>
+        <w:t xml:space="preserve">., </w:t>
+      </w:r>
+      <w:proofErr w:type="spellStart"/>
+      <w:r>
+        <w:sz w:val="22"/>
+        <w:szCs w:val="22"/>
+        <w:lang w:val="en-ID"/>
+        <w:t xml:space="preserve">APEC.Eng</w:t>
+      </w:r>
+      <w:proofErr w:type="spellEnd"/>
+    </w:p>
+    <w:vAlign w:val="center"/>
+    <w:p>
+      <w:pPr>
+        <w:sz w:val="22"/>
+        <w:szCs w:val="22"/>
+        <w:lang w:val="en-ID"/>
+      </w:pPr>
+    </w:p>
+    <w:vAlign w:val="center"/>
+    <w:p>
+      <w:pPr>
+        <w:jc w:val="center"/>
+        <w:sz w:val="22"/>
+        <w:szCs w:val="22"/>
+        <w:lang w:val="en-ID"/>
+      </w:pPr>
+      <w:proofErr w:type="spellStart"/>
+      <w:r>
+        <w:sz w:val="22"/>
+        <w:szCs w:val="22"/>
+        <w:lang w:val="en-ID"/>
+        <w:t xml:space="preserve">Ketua</w:t>
+      </w:r>
+      <w:proofErr w:type="spellEnd"/>
+    </w:p>
+    <w:vAlign w:val="center"/>
+    <w:p>
+      <w:pPr>
+        <w:ind w:left="-15"/>
+        <w:jc w:val="center"/>
+        <w:sz w:val="22"/>
+        <w:szCs w:val="22"/>
+        <w:lang w:val="en-ID"/>
+      </w:pPr>
+      <w:r>
+        <w:sz w:val="22"/>
+        <w:szCs w:val="22"/>
+        <w:lang w:val="en-ID"/>
+        <w:t xml:space="preserve">2</w:t>
+      </w:r>
+    </w:p>
+    <w:vAlign w:val="center"/>
+    <w:p>
+      <w:pPr>
+        <w:sz w:val="22"/>
+        <w:szCs w:val="22"/>
+        <w:lang w:val="en-ID"/>
+      </w:pPr>
+      <w:r>
+        <w:sz w:val="22"/>
+        <w:szCs w:val="22"/>
+        <w:lang w:val="en-ID"/>
+        <w:t xml:space="preserve">Nurul Hidayati Binti </w:t>
+      </w:r>
+      <w:proofErr w:type="spellStart"/>
+      <w:r>
+        <w:sz w:val="22"/>
+        <w:szCs w:val="22"/>
+        <w:lang w:val="en-ID"/>
+        <w:t xml:space="preserve">Saidan</w:t>
+      </w:r>
+      <w:proofErr w:type="spellEnd"/>
+      <w:r>
+        <w:sz w:val="22"/>
+        <w:szCs w:val="22"/>
+        <w:lang w:val="en-ID"/>
+        <w:t xml:space="preserve">, S.T., M.T.</w:t>
+      </w:r>
+    </w:p>
+    <w:vAlign w:val="center"/>
+    <w:p>
+      <w:pPr>
+        <w:sz w:val="22"/>
+        <w:szCs w:val="22"/>
+        <w:lang w:val="en-ID"/>
+      </w:pPr>
+      <w:r>
+        <w:sz w:val="22"/>
+        <w:szCs w:val="22"/>
+        <w:lang w:val="en-ID"/>
+        <w:t xml:space="preserve">198912192025062001</w:t>
+      </w:r>
+    </w:p>
+    <w:vAlign w:val="center"/>
+    <w:p>
+      <w:pPr>
+        <w:jc w:val="center"/>
+        <w:sz w:val="22"/>
+        <w:szCs w:val="22"/>
+        <w:lang w:val="en-ID"/>
+      </w:pPr>
+      <w:proofErr w:type="spellStart"/>
+      <w:r>
+        <w:sz w:val="22"/>
+        <w:szCs w:val="22"/>
+        <w:lang w:val="en-ID"/>
+        <w:t xml:space="preserve">Sekretaris</w:t>
+      </w:r>
+      <w:proofErr w:type="spellEnd"/>
+    </w:p>
+    <w:vAlign w:val="center"/>
+    <w:p>
+      <w:pPr>
+        <w:ind w:left="-15"/>
+        <w:jc w:val="center"/>
+        <w:sz w:val="22"/>
+        <w:szCs w:val="22"/>
+        <w:lang w:val="en-ID"/>
+      </w:pPr>
+      <w:r>
+        <w:sz w:val="22"/>
+        <w:szCs w:val="22"/>
+        <w:lang w:val="en-ID"/>
+        <w:t xml:space="preserve">3</w:t>
+      </w:r>
+    </w:p>
+    <w:vAlign w:val="center"/>
+    <w:p>
+      <w:pPr>
+        <w:sz w:val="22"/>
+        <w:szCs w:val="22"/>
+        <w:lang w:val="sv-SE"/>
+      </w:pPr>
+      <w:r>
+        <w:sz w:val="22"/>
+        <w:szCs w:val="22"/>
+        <w:lang w:val="sv-SE"/>
+        <w:t xml:space="preserve">Ir.Syarifah Keumala Intan, S</w:t>
+      </w:r>
+      <w:r>
+        <w:sz w:val="22"/>
+        <w:szCs w:val="22"/>
+        <w:lang w:val="sv-SE"/>
+        <w:t xml:space="preserve">.T., M.T.</w:t>
+      </w:r>
+    </w:p>
+    <w:vAlign w:val="center"/>
+    <w:p>
+      <w:pPr>
+        <w:sz w:val="22"/>
+        <w:szCs w:val="22"/>
+        <w:lang w:val="sv-SE"/>
+      </w:pPr>
+    </w:p>
+    <w:vAlign w:val="center"/>
+    <w:p>
+      <w:pPr>
+        <w:jc w:val="center"/>
+        <w:sz w:val="22"/>
+        <w:szCs w:val="22"/>
+        <w:lang w:val="en-ID"/>
+      </w:pPr>
+      <w:proofErr w:type="spellStart"/>
+      <w:r>
+        <w:sz w:val="22"/>
+        <w:szCs w:val="22"/>
+        <w:lang w:val="en-ID"/>
+        <w:t xml:space="preserve">{{Pembimbing1}}</w:t>
+      </w:r>
+    </w:p>
+    <w:vAlign w:val="center"/>
+    <w:p>
+      <w:pPr>
+        <w:ind w:left="-15"/>
+        <w:jc w:val="center"/>
+        <w:sz w:val="22"/>
+        <w:szCs w:val="22"/>
+        <w:lang w:val="en-ID"/>
+      </w:pPr>
+      <w:r>
+        <w:sz w:val="22"/>
+        <w:szCs w:val="22"/>
+        <w:lang w:val="en-ID"/>
+        <w:t xml:space="preserve">4</w:t>
+      </w:r>
+    </w:p>
+    <w:vAlign w:val="center"/>
+    <w:p>
+      <w:pPr>
+        <w:sz w:val="22"/>
+        <w:szCs w:val="22"/>
+        <w:lang w:val="en-ID"/>
+      </w:pPr>
+    </w:p>
+    <w:vAlign w:val="center"/>
+    <w:p>
+      <w:pPr>
+        <w:sz w:val="22"/>
+        <w:szCs w:val="22"/>
+        <w:lang w:val="en-ID"/>
+      </w:pPr>
+    </w:p>
+    <w:vAlign w:val="center"/>
+    <w:p>
+      <w:pPr>
+        <w:jc w:val="center"/>
+        <w:sz w:val="22"/>
+        <w:szCs w:val="22"/>
+        <w:lang w:val="en-ID"/>
+      </w:pPr>
+      <w:proofErr w:type="spellStart"/>
+      <w:r>
+        <w:sz w:val="22"/>
+        <w:szCs w:val="22"/>
+        <w:lang w:val="en-ID"/>
+        <w:t xml:space="preserve">{{Pembimbing2}}</w:t>
+      </w:r>
+      <w:proofErr w:type="spellEnd"/>
+    </w:p>
+    <w:vAlign w:val="center"/>
+    <w:p>
+      <w:pPr>
+        <w:ind w:left="-15"/>
+        <w:jc w:val="center"/>
+        <w:sz w:val="22"/>
+        <w:szCs w:val="22"/>
+        <w:lang w:val="en-ID"/>
+      </w:pPr>
+      <w:r>
+        <w:sz w:val="22"/>
+        <w:szCs w:val="22"/>
+        <w:lang w:val="en-ID"/>
+        <w:t xml:space="preserve">5</w:t>
+      </w:r>
+    </w:p>
+    <w:vAlign w:val="center"/>
+    <w:p>
+      <w:pPr>
+        <w:sz w:val="22"/>
+        <w:szCs w:val="22"/>
+        <w:lang w:val="en-ID"/>
+      </w:pPr>
+    </w:p>
+    <w:vAlign w:val="center"/>
+    <w:p>
+      <w:pPr>
+        <w:sz w:val="22"/>
+        <w:szCs w:val="22"/>
+        <w:lang w:val="en-ID"/>
+      </w:pPr>
+    </w:p>
+    <w:vAlign w:val="center"/>
+    <w:p>
+      <w:pPr>
+        <w:jc w:val="center"/>
+        <w:sz w:val="22"/>
+        <w:szCs w:val="22"/>
+        <w:lang w:val="en-ID"/>
+      </w:pPr>
+      <w:proofErr w:type="spellStart"/>
+      <w:r>
+        <w:sz w:val="22"/>
+        <w:szCs w:val="22"/>
+        <w:lang w:val="en-ID"/>
+        <w:t xml:space="preserve">{{Penguji1}}</w:t>
+      </w:r>
+    </w:p>
+    <w:vAlign w:val="center"/>
+    <w:p>
+      <w:pPr>
+        <w:ind w:left="-15"/>
+        <w:jc w:val="center"/>
+        <w:sz w:val="22"/>
+        <w:szCs w:val="22"/>
+        <w:lang w:val="en-ID"/>
+      </w:pPr>
+      <w:r>
+        <w:sz w:val="22"/>
+        <w:szCs w:val="22"/>
+        <w:lang w:val="en-ID"/>
+        <w:t xml:space="preserve">6</w:t>
+      </w:r>
+    </w:p>
+    <w:vAlign w:val="center"/>
+    <w:p>
+      <w:pPr>
+        <w:sz w:val="22"/>
+        <w:szCs w:val="22"/>
+        <w:lang w:val="en-ID"/>
+      </w:pPr>
+    </w:p>
+    <w:vAlign w:val="center"/>
+    <w:p>
+      <w:pPr>
+        <w:sz w:val="22"/>
+        <w:szCs w:val="22"/>
+        <w:lang w:val="en-ID"/>
+      </w:pPr>
+    </w:p>
+    <w:vAlign w:val="center"/>
+    <w:p>
+      <w:pPr>
+        <w:jc w:val="center"/>
+        <w:sz w:val="22"/>
+        <w:szCs w:val="22"/>
+        <w:lang w:val="en-ID"/>
+      </w:pPr>
+      <w:proofErr w:type="spellStart"/>
+      <w:r>
+        <w:sz w:val="22"/>
+        <w:szCs w:val="22"/>
+        <w:lang w:val="en-ID"/>
+        <w:t xml:space="preserve">{{Penguji2}}</w:t>
+        <w:br/>
+        <w:t>{{Penguji3}}</w:t>
+      </w:r>
+    </w:p>
+    <w:p>
+      <w:pPr>
+        <w:lang w:val="sv-SE"/>
       </w:pPr>
     </w:p>
     <w:p>
       <w:pPr>
         <w:ind w:left="567"/>
-        <w:rPr>
-          <w:lang w:val="sv-SE"/>
-        </w:rPr>
-      </w:pPr>
-      <w:r>
-        <w:rPr>
-          <w:lang w:val="sv-SE"/>
-        </w:rPr>
+        <w:lang w:val="sv-SE"/>
+      </w:pPr>
+      <w:r>
+        <w:lang w:val="sv-SE"/>
         <w:t xml:space="preserve">Demikian yang dapat kami sampaikan, atas kerjasama yang baik dan kehadiran Bapak/Ibu tepat waktu diucapkan terima kasih. </w:t>
       </w:r>
     </w:p>
     <w:p>
       <w:pPr>
-        <w:rPr>
-          <w:lang w:val="sv-SE"/>
-        </w:rPr>
+        <w:lang w:val="sv-SE"/>
       </w:pPr>
     </w:p>
     <w:p>
       <w:pPr>
         <w:ind w:left="5387"/>
         <w:jc w:val="center"/>
-        <w:rPr>
-          <w:lang w:val="sv-SE"/>
-        </w:rPr>
+        <w:lang w:val="sv-SE"/>
       </w:pPr>
     </w:p>
     <w:p>
       <w:pPr>
         <w:ind w:left="5387"/>
         <w:jc w:val="center"/>
-        <w:rPr>
-          <w:lang w:val="sv-SE"/>
-        </w:rPr>
-      </w:pPr>
-      <w:r>
-        <w:rPr>
-          <w:lang w:val="sv-SE"/>
-        </w:rPr>
-        <w:t>Kepala Program Studi</w:t>
+        <w:lang w:val="sv-SE"/>
+      </w:pPr>
+      <w:r>
+        <w:lang w:val="sv-SE"/>
+        <w:t xml:space="preserve">Kepala Program Studi</w:t>
       </w:r>
     </w:p>
     <w:p>
       <w:pPr>
         <w:ind w:left="5387"/>
         <w:jc w:val="center"/>
-        <w:rPr>
-          <w:color w:val="EE0000"/>
-          <w:lang w:val="sv-SE"/>
-        </w:rPr>
-      </w:pPr>
-      <w:r>
-        <w:rPr>
-          <w:color w:val="EE0000"/>
-          <w:lang w:val="sv-SE"/>
-        </w:rPr>
-        <w:t>D</w:t>
-      </w:r>
-      <w:r>
-        <w:rPr>
-          <w:color w:val="EE0000"/>
-          <w:lang w:val="sv-SE"/>
-        </w:rPr>
+        <w:color w:val="EE0000"/>
+        <w:lang w:val="sv-SE"/>
+      </w:pPr>
+      <w:r>
+        <w:color w:val="EE0000"/>
+        <w:lang w:val="sv-SE"/>
+        <w:t xml:space="preserve">D</w:t>
+      </w:r>
+      <w:r>
+        <w:color w:val="EE0000"/>
+        <w:lang w:val="sv-SE"/>
         <w:t xml:space="preserve">iploma </w:t>
       </w:r>
       <w:r>
-        <w:rPr>
-          <w:color w:val="EE0000"/>
-          <w:lang w:val="sv-SE"/>
-        </w:rPr>
-        <w:t>IV TRKJJ</w:t>
+        <w:color w:val="EE0000"/>
+        <w:lang w:val="sv-SE"/>
+        <w:t xml:space="preserve">IV TRKJJ</w:t>
       </w:r>
     </w:p>
     <w:p>
       <w:pPr>
         <w:ind w:left="5387"/>
         <w:jc w:val="center"/>
-        <w:rPr>
-          <w:lang w:val="sv-SE"/>
-        </w:rPr>
+        <w:lang w:val="sv-SE"/>
       </w:pPr>
     </w:p>
     <w:p>
       <w:pPr>
         <w:ind w:left="5387"/>
         <w:jc w:val="center"/>
-        <w:rPr>
-          <w:lang w:val="sv-SE"/>
-        </w:rPr>
+        <w:lang w:val="sv-SE"/>
       </w:pPr>
     </w:p>
     <w:p>
       <w:pPr>
         <w:ind w:left="5387"/>
         <w:jc w:val="center"/>
-        <w:rPr>
-          <w:lang w:val="sv-SE"/>
-        </w:rPr>
+        <w:lang w:val="sv-SE"/>
       </w:pPr>
     </w:p>
     <w:p>
       <w:pPr>
         <w:ind w:left="5387"/>
         <w:jc w:val="center"/>
-        <w:rPr>
-          <w:b/>
-          <w:bCs/>
-          <w:lang w:val="sv-SE"/>
-        </w:rPr>
-      </w:pPr>
-      <w:r>
-        <w:rPr>
-          <w:b/>
-          <w:bCs/>
-          <w:lang w:val="sv-SE"/>
-        </w:rPr>
-        <w:t>Ir. Deni Iqbal, S.</w:t>
-      </w:r>
-      <w:r>
-        <w:rPr>
-          <w:b/>
-          <w:bCs/>
-          <w:lang w:val="sv-SE"/>
-        </w:rPr>
-        <w:t>S</w:t>
-      </w:r>
-      <w:r>
-        <w:rPr>
-          <w:b/>
-          <w:bCs/>
-          <w:lang w:val="sv-SE"/>
-        </w:rPr>
-        <w:t>T</w:t>
-      </w:r>
-      <w:r>
-        <w:rPr>
-          <w:b/>
-          <w:bCs/>
-          <w:lang w:val="sv-SE"/>
-        </w:rPr>
-        <w:t>,</w:t>
-      </w:r>
-      <w:r>
-        <w:rPr>
-          <w:b/>
-          <w:bCs/>
-          <w:lang w:val="sv-SE"/>
-        </w:rPr>
+        <w:b/>
+        <w:bCs/>
+        <w:lang w:val="sv-SE"/>
+      </w:pPr>
+      <w:r>
+        <w:b/>
+        <w:bCs/>
+        <w:lang w:val="sv-SE"/>
+        <w:t xml:space="preserve">Ir. Deni Iqbal, S.</w:t>
+      </w:r>
+      <w:r>
+        <w:b/>
+        <w:bCs/>
+        <w:lang w:val="sv-SE"/>
+        <w:t xml:space="preserve">S</w:t>
+      </w:r>
+      <w:r>
+        <w:b/>
+        <w:bCs/>
+        <w:lang w:val="sv-SE"/>
+        <w:t xml:space="preserve">T</w:t>
+      </w:r>
+      <w:r>
+        <w:b/>
+        <w:bCs/>
+        <w:lang w:val="sv-SE"/>
+        <w:t xml:space="preserve">,</w:t>
+      </w:r>
+      <w:r>
+        <w:b/>
+        <w:bCs/>
+        <w:lang w:val="sv-SE"/>
         <w:t xml:space="preserve"> M.T.</w:t>
       </w:r>
     </w:p>
@@ -1402,75 +889,57 @@
       <w:pPr>
         <w:ind w:left="5387"/>
         <w:jc w:val="center"/>
-        <w:rPr>
-          <w:lang w:val="sv-SE"/>
-        </w:rPr>
-      </w:pPr>
-      <w:r>
-        <w:rPr>
-          <w:lang w:val="sv-SE"/>
-        </w:rPr>
+        <w:lang w:val="sv-SE"/>
+      </w:pPr>
+      <w:r>
+        <w:lang w:val="sv-SE"/>
         <w:t xml:space="preserve">NIP. </w:t>
       </w:r>
       <w:r>
-        <w:rPr>
-          <w:lang w:val="sv-SE"/>
-        </w:rPr>
-        <w:t>19910505 202203 1 007</w:t>
+        <w:lang w:val="sv-SE"/>
+        <w:t xml:space="preserve">19910505 202203 1 007</w:t>
       </w:r>
     </w:p>
     <w:p>
       <w:pPr>
         <w:ind w:left="5387"/>
         <w:jc w:val="center"/>
-        <w:rPr>
-          <w:lang w:val="sv-SE"/>
-        </w:rPr>
+        <w:lang w:val="sv-SE"/>
       </w:pPr>
     </w:p>
     <w:p>
       <w:pPr>
         <w:ind w:left="5387"/>
         <w:jc w:val="center"/>
-        <w:rPr>
-          <w:lang w:val="sv-SE"/>
-        </w:rPr>
+        <w:lang w:val="sv-SE"/>
       </w:pPr>
     </w:p>
     <w:p>
       <w:pPr>
         <w:ind w:left="5387"/>
         <w:jc w:val="center"/>
-        <w:rPr>
-          <w:lang w:val="sv-SE"/>
-        </w:rPr>
+        <w:lang w:val="sv-SE"/>
       </w:pPr>
     </w:p>
     <w:p>
       <w:pPr>
         <w:ind w:left="5387"/>
         <w:jc w:val="center"/>
-        <w:rPr>
-          <w:lang w:val="sv-SE"/>
-        </w:rPr>
+        <w:lang w:val="sv-SE"/>
       </w:pPr>
     </w:p>
     <w:p>
       <w:pPr>
         <w:ind w:left="567"/>
         <w:jc w:val="both"/>
-        <w:rPr>
-          <w:sz w:val="18"/>
-          <w:szCs w:val="18"/>
-          <w:lang w:val="sv-SE"/>
-        </w:rPr>
-      </w:pPr>
-      <w:r>
-        <w:rPr>
-          <w:sz w:val="18"/>
-          <w:szCs w:val="18"/>
-          <w:lang w:val="sv-SE"/>
-        </w:rPr>
+        <w:sz w:val="18"/>
+        <w:szCs w:val="18"/>
+        <w:lang w:val="sv-SE"/>
+      </w:pPr>
+      <w:r>
+        <w:sz w:val="18"/>
+        <w:szCs w:val="18"/>
+        <w:lang w:val="sv-SE"/>
         <w:t xml:space="preserve">Catatan: </w:t>
       </w:r>
     </w:p>
@@ -1483,18 +952,14 @@
         </w:numPr>
         <w:ind w:left="851" w:hanging="284"/>
         <w:jc w:val="both"/>
-        <w:rPr>
-          <w:sz w:val="18"/>
-          <w:szCs w:val="18"/>
-          <w:lang w:val="sv-SE"/>
-        </w:rPr>
-      </w:pPr>
-      <w:r>
-        <w:rPr>
-          <w:sz w:val="18"/>
-          <w:szCs w:val="18"/>
-          <w:lang w:val="sv-SE"/>
-        </w:rPr>
+        <w:sz w:val="18"/>
+        <w:szCs w:val="18"/>
+        <w:lang w:val="sv-SE"/>
+      </w:pPr>
+      <w:r>
+        <w:sz w:val="18"/>
+        <w:szCs w:val="18"/>
+        <w:lang w:val="sv-SE"/>
         <w:t xml:space="preserve">Seluruh Perangkat Seminar wajib menggunakan pakaian sopan. Pria boleh memakai kemeja berdasi, baju batik, atau baju muslim, sedangkan wanita dapat menyesuaikan; </w:t>
       </w:r>
     </w:p>
@@ -1507,119 +972,95 @@
         </w:numPr>
         <w:ind w:left="851" w:hanging="284"/>
         <w:jc w:val="both"/>
-        <w:rPr>
-          <w:sz w:val="10"/>
-          <w:szCs w:val="10"/>
-          <w:lang w:val="sv-SE"/>
-        </w:rPr>
-      </w:pPr>
-      <w:r>
-        <w:rPr>
-          <w:sz w:val="18"/>
-          <w:szCs w:val="18"/>
-          <w:lang w:val="sv-SE"/>
-        </w:rPr>
-        <w:t>Bagi Perangkat Seminar yang berhalangan hadir, harap menghubungi Kaprodi/Koordinator Seminar</w:t>
+        <w:sz w:val="10"/>
+        <w:szCs w:val="10"/>
+        <w:lang w:val="sv-SE"/>
+      </w:pPr>
+      <w:r>
+        <w:sz w:val="18"/>
+        <w:szCs w:val="18"/>
+        <w:lang w:val="sv-SE"/>
+        <w:t xml:space="preserve">Bagi Perangkat Seminar yang berhalangan hadir, harap menghubungi Kaprodi/Koordinator Seminar</w:t>
       </w:r>
     </w:p>
     <w:p>
       <w:pPr>
         <w:jc w:val="both"/>
-        <w:rPr>
-          <w:sz w:val="10"/>
-          <w:szCs w:val="10"/>
-          <w:lang w:val="sv-SE"/>
-        </w:rPr>
+        <w:sz w:val="10"/>
+        <w:szCs w:val="10"/>
+        <w:lang w:val="sv-SE"/>
       </w:pPr>
     </w:p>
     <w:p>
       <w:pPr>
         <w:jc w:val="both"/>
-        <w:rPr>
-          <w:sz w:val="10"/>
-          <w:szCs w:val="10"/>
-          <w:lang w:val="sv-SE"/>
-        </w:rPr>
+        <w:sz w:val="10"/>
+        <w:szCs w:val="10"/>
+        <w:lang w:val="sv-SE"/>
       </w:pPr>
     </w:p>
     <w:p>
       <w:pPr>
         <w:jc w:val="both"/>
-        <w:rPr>
-          <w:sz w:val="10"/>
-          <w:szCs w:val="10"/>
-          <w:lang w:val="sv-SE"/>
-        </w:rPr>
+        <w:sz w:val="10"/>
+        <w:szCs w:val="10"/>
+        <w:lang w:val="sv-SE"/>
       </w:pPr>
     </w:p>
     <w:p>
       <w:pPr>
         <w:jc w:val="both"/>
-        <w:rPr>
-          <w:sz w:val="10"/>
-          <w:szCs w:val="10"/>
-          <w:lang w:val="sv-SE"/>
-        </w:rPr>
+        <w:sz w:val="10"/>
+        <w:szCs w:val="10"/>
+        <w:lang w:val="sv-SE"/>
       </w:pPr>
     </w:p>
     <w:p>
       <w:pPr>
         <w:jc w:val="both"/>
-        <w:rPr>
-          <w:sz w:val="10"/>
-          <w:szCs w:val="10"/>
-          <w:lang w:val="sv-SE"/>
-        </w:rPr>
+        <w:sz w:val="10"/>
+        <w:szCs w:val="10"/>
+        <w:lang w:val="sv-SE"/>
       </w:pPr>
     </w:p>
     <w:p>
       <w:pPr>
         <w:jc w:val="both"/>
-        <w:rPr>
-          <w:sz w:val="10"/>
-          <w:szCs w:val="10"/>
-          <w:lang w:val="sv-SE"/>
-        </w:rPr>
+        <w:sz w:val="10"/>
+        <w:szCs w:val="10"/>
+        <w:lang w:val="sv-SE"/>
       </w:pPr>
     </w:p>
     <w:p>
       <w:pPr>
         <w:jc w:val="both"/>
-        <w:rPr>
-          <w:sz w:val="10"/>
-          <w:szCs w:val="10"/>
-          <w:lang w:val="sv-SE"/>
-        </w:rPr>
+        <w:sz w:val="10"/>
+        <w:szCs w:val="10"/>
+        <w:lang w:val="sv-SE"/>
       </w:pPr>
     </w:p>
     <w:p>
       <w:pPr>
         <w:jc w:val="both"/>
-        <w:rPr>
-          <w:sz w:val="10"/>
-          <w:szCs w:val="10"/>
-          <w:lang w:val="sv-SE"/>
-        </w:rPr>
+        <w:sz w:val="10"/>
+        <w:szCs w:val="10"/>
+        <w:lang w:val="sv-SE"/>
       </w:pPr>
     </w:p>
     <w:p>
       <w:pPr>
         <w:jc w:val="both"/>
-        <w:rPr>
-          <w:sz w:val="10"/>
-          <w:szCs w:val="10"/>
-          <w:lang w:val="sv-SE"/>
-        </w:rPr>
+        <w:sz w:val="10"/>
+        <w:szCs w:val="10"/>
+        <w:lang w:val="sv-SE"/>
       </w:pPr>
     </w:p>
     <w:p>
       <w:pPr>
         <w:jc w:val="both"/>
-        <w:rPr>
-          <w:sz w:val="10"/>
-          <w:szCs w:val="10"/>
-          <w:lang w:val="sv-SE"/>
-        </w:rPr>
+        <w:sz w:val="10"/>
+        <w:szCs w:val="10"/>
+        <w:lang w:val="sv-SE"/>
       </w:pPr>
     </w:p>
     <w:sectPr>

</xml_diff>